<commit_message>
Samtidige-rapporter ekskluderer nå ikke-planlagte klasser.
</commit_message>
<xml_diff>
--- a/docs/hjelp.docx
+++ b/docs/hjelp.docx
@@ -521,15 +521,7 @@
       </w:r>
       <w:r>
         <w:lastRenderedPageBreak/>
-        <w:t xml:space="preserve">regnskapssystemet kan importere. Foreløpig er det kun støtte for </w:t>
-      </w:r>
-      <w:proofErr w:type="spellStart"/>
-      <w:r>
-        <w:t>Tripletex</w:t>
-      </w:r>
-      <w:proofErr w:type="spellEnd"/>
-      <w:r>
-        <w:t xml:space="preserve">. Excel-filen som blir </w:t>
+        <w:t xml:space="preserve">regnskapssystemet kan importere. Foreløpig er det kun støtte for Tripletex. Excel-filen som blir </w:t>
       </w:r>
       <w:proofErr w:type="gramStart"/>
       <w:r>
@@ -551,14 +543,21 @@
       </w:r>
     </w:p>
     <w:bookmarkEnd w:id="0"/>
+    <w:p/>
     <w:p>
       <w:proofErr w:type="spellStart"/>
       <w:r>
         <w:t>Brikkesys</w:t>
       </w:r>
+      <w:r>
+        <w:t>Tillegg</w:t>
+      </w:r>
       <w:proofErr w:type="spellEnd"/>
       <w:r>
-        <w:t xml:space="preserve"> Trekkeplan består av 2 filer</w:t>
+        <w:t xml:space="preserve"> </w:t>
+      </w:r>
+      <w:r>
+        <w:t>består av 2 filer</w:t>
       </w:r>
       <w:r>
         <w:t xml:space="preserve"> (exe- og </w:t>
@@ -584,7 +583,10 @@
         <w:t>C</w:t>
       </w:r>
       <w:r>
-        <w:t>:\BrikkesysTrekkeplan</w:t>
+        <w:t>:\Brikkesys</w:t>
+      </w:r>
+      <w:r>
+        <w:t>Tillegg</w:t>
       </w:r>
       <w:r>
         <w:br/>

</xml_diff>